<commit_message>
Agrega Tipo de compra al Mantenimiento Correctivo (Trato Directo / Compra Ágil)
Nuevo campo en el formulario del Paso 10:

- Lista desplegable Tipo de compra con Trato Directo y Compra Ágil
  (opcional: «Sin compra asociada»).
- Al elegir Trato Directo se despliega el sub-formulario que exige
  N° de informe técnico, fecha del informe técnico y empresa.
- La lista de empresas es administrable desde el propio selector
  (opción «Agregar nueva empresa»), se conserva entre sesiones y viaja
  en el respaldo.
- La tabla de eventos del detalle muestra la compra con su informe y
  empresa; la hoja Correctivos del Excel suma las columnas Tipo de
  compra, N° informe técnico, Fecha informe técnico y Empresa.
- Respaldos antiguos sin empresas siguen restaurando sin problemas.

Actualiza la especificación Word (docs/) con los dos puntos nuevos del
Paso 10.

https://claude.ai/code/session_01NhvBx4HahisbYSnWJwVNHY
</commit_message>
<xml_diff>
--- a/docs/Flujo_Sistema_Gestion_MP_2026.docx
+++ b/docs/Flujo_Sistema_Gestion_MP_2026.docx
@@ -3620,6 +3620,32 @@
       </w:r>
       <w:r>
         <w:t xml:space="preserve">lista desplegable con las opciones Operativo / No Operativo / Servicio Técnico.</w:t>
+      </w:r>
+    </w:p>
+    <w:p>
+      <w:pPr>
+        <w:pStyle w:val="ListParagraph"/>
+        <w:numPr>
+          <w:ilvl w:val="0"/>
+          <w:numId w:val="2"/>
+        </w:numPr>
+        <w:spacing w:after="60"/>
+      </w:pPr>
+      <w:r>
+        <w:t xml:space="preserve">Tipo de compra: lista desplegable con las opciones Trato Directo y Compra Ágil.</w:t>
+      </w:r>
+    </w:p>
+    <w:p>
+      <w:pPr>
+        <w:pStyle w:val="ListParagraph"/>
+        <w:numPr>
+          <w:ilvl w:val="0"/>
+          <w:numId w:val="2"/>
+        </w:numPr>
+        <w:spacing w:after="60"/>
+      </w:pPr>
+      <w:r>
+        <w:t xml:space="preserve">Si la compra es por Trato Directo, se solicita un formulario para registrar el número de informe técnico, la fecha del informe técnico y una lista desplegable con empresas.</w:t>
       </w:r>
     </w:p>
     <w:p>

</xml_diff>

<commit_message>
Agrega responsable del informe técnico y N° de orden de compra
En el Tipo de compra del Mantenimiento Correctivo:

- Trato Directo suma la lista desplegable Responsable del informe
  técnico (mismos nombres de la lista Ejecutor), obligatoria junto al
  n° y fecha del informe y la empresa.
- Nuevo campo N° de orden de compra, disponible tanto para Trato
  Directo como para Compra Ágil (opcional).
- La tabla de eventos del detalle muestra responsable y OC; la hoja
  Correctivos del Excel suma las columnas Responsable informe técnico
  y N° orden de compra.
- Verificada la restauración del respaldo real v2 (966 equipos,
  2 eventos correctivos y lista de empresas).

Actualiza la especificación Word (docs/) con ambos puntos del Paso 10.

https://claude.ai/code/session_01NhvBx4HahisbYSnWJwVNHY
</commit_message>
<xml_diff>
--- a/docs/Flujo_Sistema_Gestion_MP_2026.docx
+++ b/docs/Flujo_Sistema_Gestion_MP_2026.docx
@@ -3645,7 +3645,20 @@
         <w:spacing w:after="60"/>
       </w:pPr>
       <w:r>
-        <w:t xml:space="preserve">Si la compra es por Trato Directo, se solicita un formulario para registrar el número de informe técnico, la fecha del informe técnico y una lista desplegable con empresas.</w:t>
+        <w:t xml:space="preserve">Si la compra es por Trato Directo, se solicita un formulario para registrar el número de informe técnico, la fecha del informe técnico, el responsable del informe técnico (lista desplegable con los mismos nombres de la lista Ejecutor) y una lista desplegable con empresas.</w:t>
+      </w:r>
+    </w:p>
+    <w:p>
+      <w:pPr>
+        <w:pStyle w:val="ListParagraph"/>
+        <w:numPr>
+          <w:ilvl w:val="0"/>
+          <w:numId w:val="2"/>
+        </w:numPr>
+        <w:spacing w:after="60"/>
+      </w:pPr>
+      <w:r>
+        <w:t xml:space="preserve">Orden de compra: registro del número de la orden de compra asociada a la compra (Trato Directo o Compra Ágil).</w:t>
       </w:r>
     </w:p>
     <w:p>

</xml_diff>

<commit_message>
Agrega detalle de orden de compra y cierre de eventos correctivos
A partir del caso real OC 1488-466-TD26 (27-03-2026):

- La sección de compra suma Fecha de orden de compra y Descripción de
  la orden de compra (equipos y series incluidas, folios ST y
  cotizaciones), disponibles para Trato Directo y Compra Ágil.
- Nuevo Estado del evento (Abierto / Cerrado) con fecha de cierre
  obligatoria al cerrar; la tabla de eventos muestra el estado y la
  hoja Correctivos del Excel suma las cuatro columnas nuevas.
- Eventos existentes sin estado se consideran Abiertos.

Actualiza la especificación Word (docs/) y agrega .gitignore para
respaldos y exportaciones con datos operacionales.

https://claude.ai/code/session_01NhvBx4HahisbYSnWJwVNHY
</commit_message>
<xml_diff>
--- a/docs/Flujo_Sistema_Gestion_MP_2026.docx
+++ b/docs/Flujo_Sistema_Gestion_MP_2026.docx
@@ -3658,7 +3658,20 @@
         <w:spacing w:after="60"/>
       </w:pPr>
       <w:r>
-        <w:t xml:space="preserve">Orden de compra: registro del número de la orden de compra asociada a la compra (Trato Directo o Compra Ágil).</w:t>
+        <w:t xml:space="preserve">Orden de compra: registro del número, la fecha y la descripción de la orden de compra asociada (Trato Directo o Compra Ágil).</w:t>
+      </w:r>
+    </w:p>
+    <w:p>
+      <w:pPr>
+        <w:pStyle w:val="ListParagraph"/>
+        <w:numPr>
+          <w:ilvl w:val="0"/>
+          <w:numId w:val="2"/>
+        </w:numPr>
+        <w:spacing w:after="60"/>
+      </w:pPr>
+      <w:r>
+        <w:t xml:space="preserve">Estado del evento: Abierto / Cerrado; al cerrar el evento se registra la fecha de cierre.</w:t>
       </w:r>
     </w:p>
     <w:p>

</xml_diff>

<commit_message>
Documenta el flujo ordenado del Mantenimiento Correctivo
Agrega a la especificación la sección «Flujo del Mantenimiento
Correctivo — Ciclo de la Orden de Trabajo», construida y validada con
los dos casos reales (OT 19-997 cerrada y OT 19-10081 abierta):

- Seis etapas ordenadas: Apertura (con criticidad según estado del
  equipo), Evaluación técnica, Gestión de compra (cotización →
  informe técnico → OC → envío a proveedor), Espera y recepción,
  Ejecución (Reporte de Servicio con el mismo folio) y Cierre con
  métricas de ciclo y detención.
- Reglas transversales: el folio SIGEM agrupa el expediente, una OC
  puede cubrir varios equipos y la ficha refleja el último estado.

https://claude.ai/code/session_01NhvBx4HahisbYSnWJwVNHY
</commit_message>
<xml_diff>
--- a/docs/Flujo_Sistema_Gestion_MP_2026.docx
+++ b/docs/Flujo_Sistema_Gestion_MP_2026.docx
@@ -3712,6 +3712,105 @@
       </w:r>
       <w:r>
         <w:t xml:space="preserve">dos botones — Oficial / Borrador.</w:t>
+      </w:r>
+    </w:p>
+    <w:p>
+      <w:pPr>
+        <w:pStyle w:val="Heading2"/>
+      </w:pPr>
+      <w:r>
+        <w:t xml:space="preserve">Flujo del Mantenimiento Correctivo — Ciclo de la Orden de Trabajo</w:t>
+      </w:r>
+    </w:p>
+    <w:p>
+      <w:pPr>
+        <w:pStyle w:val="ListParagraph"/>
+        <w:numPr>
+          <w:ilvl w:val="0"/>
+          <w:numId w:val="2"/>
+        </w:numPr>
+        <w:spacing w:after="60"/>
+      </w:pPr>
+      <w:r>
+        <w:t xml:space="preserve">Etapa 1 — Apertura: se genera la OT (folio SIGEM, requerimiento, técnico asignado) y se registra el estado del equipo. Equipo Operativo con falla: flujo normal (se mide el ciclo administrativo). Equipo No Operativo: flujo crítico (se miden los días de detención y se crea de inmediato una gestión pendiente con las tareas del ciclo). El evento nace Abierto.</w:t>
+      </w:r>
+    </w:p>
+    <w:p>
+      <w:pPr>
+        <w:pStyle w:val="ListParagraph"/>
+        <w:numPr>
+          <w:ilvl w:val="0"/>
+          <w:numId w:val="2"/>
+        </w:numPr>
+        <w:spacing w:after="60"/>
+      </w:pPr>
+      <w:r>
+        <w:t xml:space="preserve">Etapa 2 — Evaluación técnica: el técnico evalúa la falla y define el camino: reparación interna (pasa a Ejecución), compra de repuesto o servicio (pasa a Gestión de compra) o Envío a Servicio Técnico (evento propio; el equipo queda en estado Servicio Técnico).</w:t>
+      </w:r>
+    </w:p>
+    <w:p>
+      <w:pPr>
+        <w:pStyle w:val="ListParagraph"/>
+        <w:numPr>
+          <w:ilvl w:val="0"/>
+          <w:numId w:val="2"/>
+        </w:numPr>
+        <w:spacing w:after="60"/>
+      </w:pPr>
+      <w:r>
+        <w:t xml:space="preserve">Etapa 3 — Gestión de compra, en este orden: 1) solicitar cotización al proveedor; 2) recibir la cotización (n° y fecha); 3) elaborar el informe técnico respaldado en la cotización (n°, fecha y responsable); 4) emitir la orden de compra (Trato Directo o Compra Ágil, con n°, fecha y descripción); 5) enviar la orden de compra al proveedor (desde aquí corre el plazo del proveedor). Cada paso se registra como tarea del pendiente y actualización de la gestión asociada.</w:t>
+      </w:r>
+    </w:p>
+    <w:p>
+      <w:pPr>
+        <w:pStyle w:val="ListParagraph"/>
+        <w:numPr>
+          <w:ilvl w:val="0"/>
+          <w:numId w:val="2"/>
+        </w:numPr>
+        <w:spacing w:after="60"/>
+      </w:pPr>
+      <w:r>
+        <w:t xml:space="preserve">Etapa 4 — Espera y recepción: seguimiento del repuesto o de la visita del proveedor mediante la gestión asociada del pendiente.</w:t>
+      </w:r>
+    </w:p>
+    <w:p>
+      <w:pPr>
+        <w:pStyle w:val="ListParagraph"/>
+        <w:numPr>
+          <w:ilvl w:val="0"/>
+          <w:numId w:val="2"/>
+        </w:numPr>
+        <w:spacing w:after="60"/>
+      </w:pPr>
+      <w:r>
+        <w:t xml:space="preserve">Etapa 5 — Ejecución: Reporte de Servicio con el mismo folio SIGEM (trabajo realizado, repuestos y pruebas de funcionamiento); se actualiza el estado del equipo, normalmente su retorno a Operativo.</w:t>
+      </w:r>
+    </w:p>
+    <w:p>
+      <w:pPr>
+        <w:pStyle w:val="ListParagraph"/>
+        <w:numPr>
+          <w:ilvl w:val="0"/>
+          <w:numId w:val="2"/>
+        </w:numPr>
+        <w:spacing w:after="60"/>
+      </w:pPr>
+      <w:r>
+        <w:t xml:space="preserve">Etapa 6 — Cierre: el evento pasa a Cerrado con su fecha de cierre y se completa el pendiente. Métricas resultantes: ciclo total, días de detención (flujo crítico) y días por etapa.</w:t>
+      </w:r>
+    </w:p>
+    <w:p>
+      <w:pPr>
+        <w:pStyle w:val="ListParagraph"/>
+        <w:numPr>
+          <w:ilvl w:val="0"/>
+          <w:numId w:val="2"/>
+        </w:numPr>
+        <w:spacing w:after="60"/>
+      </w:pPr>
+      <w:r>
+        <w:t xml:space="preserve">Reglas transversales: un folio SIGEM agrupa la OT con sus Reportes de Servicio y Envíos a Servicio Técnico (un expediente); una misma orden de compra puede cubrir varios equipos, cada uno con su propio evento y folio; la ficha del equipo refleja siempre el estado del último evento registrado (preventivo o correctivo).</w:t>
       </w:r>
     </w:p>
     <w:p>

</xml_diff>

<commit_message>
Formulario específico para el evento Envío a Servicio Técnico
Cuando el tipo de evento es Envío a Servicio Técnico, el formulario de
Mantenimiento Correctivo se adapta y solicita: fecha de envío, empresa
de destino (lista desplegable administrable, obligatoria),
descripción, folio de solicitud y técnico responsable.

- El estado del equipo queda por defecto en Servicio Técnico al elegir
  este tipo (coherente con la Etapa 2 del flujo), alimentando la ficha
  y el tablero de Operatividad.
- La tabla de eventos muestra «Enviado a: <empresa>» y el nodo
  «Envío a ST» de la línea de tiempo indica la empresa.
- La empresa se guarda en el campo existente del evento, por lo que la
  hoja Correctivos del Excel y los respaldos la incluyen sin cambios
  de estructura.

Documenta el comportamiento en la especificación Word.

https://claude.ai/code/session_01NhvBx4HahisbYSnWJwVNHY
</commit_message>
<xml_diff>
--- a/docs/Flujo_Sistema_Gestion_MP_2026.docx
+++ b/docs/Flujo_Sistema_Gestion_MP_2026.docx
@@ -3685,6 +3685,19 @@
       </w:pPr>
       <w:r>
         <w:t xml:space="preserve">Estado del evento: Abierto / Cerrado; al cerrar el evento se registra la fecha de cierre.</w:t>
+      </w:r>
+    </w:p>
+    <w:p>
+      <w:pPr>
+        <w:pStyle w:val="ListParagraph"/>
+        <w:numPr>
+          <w:ilvl w:val="0"/>
+          <w:numId w:val="2"/>
+        </w:numPr>
+        <w:spacing w:after="60"/>
+      </w:pPr>
+      <w:r>
+        <w:t xml:space="preserve">Envío a Servicio Técnico: para este tipo de evento el formulario solicita la fecha de envío, la empresa de destino (lista desplegable, obligatoria), la descripción, el folio de solicitud y el técnico responsable; el estado del equipo queda por defecto en Servicio Técnico.</w:t>
       </w:r>
     </w:p>
     <w:p>

</xml_diff>

<commit_message>
El formulario MP indica la programación que corresponde al mes elegido
Al ingresar la fecha de una mantención preventiva, el formulario
consulta la planilla para ese equipo y mes (columna P del registro y
programación PMP) y muestra qué corresponde: X, R, RA, PM o «sin
programación», listando en este último caso los meses programados del
equipo y recordando que el mes de destino de una reprogramación lleva
R (Paso 6).

- El código se sugiere automáticamente en el campo Programación; la
  elección manual del usuario prevalece y no se sobreescribe al
  cambiar la fecha.
- Si PMP y registro difieren, se muestran ambos; al editar un registro
  existente solo se informa, sin alterar el valor guardado.

Motivado por los datos reales: registros con R en meses donde la
planilla indicaba X, ahora visibles al momento de registrar.

https://claude.ai/code/session_01NhvBx4HahisbYSnWJwVNHY
</commit_message>
<xml_diff>
--- a/docs/Flujo_Sistema_Gestion_MP_2026.docx
+++ b/docs/Flujo_Sistema_Gestion_MP_2026.docx
@@ -1783,6 +1783,19 @@
       </w:pPr>
       <w:r>
         <w:t xml:space="preserve">Las mantenciones registradas en la aplicación se contabilizan en el mes de su fecha, junto a los resultados de la planilla; si la planilla trae resultado para el mismo equipo y mes, prevalece la planilla y no se duplica el conteo.</w:t>
+      </w:r>
+    </w:p>
+    <w:p>
+      <w:pPr>
+        <w:pStyle w:val="ListParagraph"/>
+        <w:numPr>
+          <w:ilvl w:val="0"/>
+          <w:numId w:val="2"/>
+        </w:numPr>
+        <w:spacing w:after="60"/>
+      </w:pPr>
+      <w:r>
+        <w:t xml:space="preserve">Al ingresar la fecha de una mantención preventiva, el formulario indica qué corresponde a ese mes según la planilla (X, R, RA, PM o sin programación, listando los meses programados del equipo) y sugiere automáticamente el código en el campo Programación; la elección manual del usuario prevalece.</w:t>
       </w:r>
     </w:p>
     <w:p>

</xml_diff>

<commit_message>
Gestión de pendientes en la propia tabla: fila expandible e inteligencia de tareas
- Clic en cualquier fila despliega un panel de trabajo dentro de la
  tabla: tareas marcables, bitácora completa de gestión y caja para
  registrar gestiones con Enter; el panel permanece abierto al
  registrar.
- Inteligencia de tareas: al marcar la última tarea se ofrece
  completar el pendiente; al completar con tareas abiertas se advierte
  cuántas faltan antes de confirmar.
- Aviso al abrir la aplicación cuando existen pendientes atrasados.

Build 2026-06-13.19. Actualiza la especificación Word (Paso 9).

https://claude.ai/code/session_01NhvBx4HahisbYSnWJwVNHY
</commit_message>
<xml_diff>
--- a/docs/Flujo_Sistema_Gestion_MP_2026.docx
+++ b/docs/Flujo_Sistema_Gestion_MP_2026.docx
@@ -3402,6 +3402,19 @@
       </w:pPr>
       <w:r>
         <w:t xml:space="preserve">El estado de gestión se deduce automáticamente: Nuevo (sin actividad), En gestión (con gestiones o tareas marcadas), En espera (marcado con motivo) y Completado (con fecha); el atraso es transversal a cualquier estado abierto.</w:t>
+      </w:r>
+    </w:p>
+    <w:p>
+      <w:pPr>
+        <w:pStyle w:val="ListParagraph"/>
+        <w:numPr>
+          <w:ilvl w:val="0"/>
+          <w:numId w:val="2"/>
+        </w:numPr>
+        <w:spacing w:after="60"/>
+      </w:pPr>
+      <w:r>
+        <w:t xml:space="preserve">Trabajo en la propia tabla: cada fila se despliega con un clic mostrando las tareas marcables, la bitácora completa de gestión y una caja para registrar gestiones, sin abrir el formulario. Al marcar la última tarea, el sistema ofrece completar el pendiente; al completar con tareas abiertas, advierte cuántas faltan antes de confirmar. Al abrir la aplicación se avisa si existen pendientes atrasados.</w:t>
       </w:r>
     </w:p>
     <w:p>

</xml_diff>

<commit_message>
Actualiza la especificación Word al estado del programa (build .20)
- Paso 9: la tabla de pendientes incorpora las columnas N° Inventario
  y Servicio, y se aclara que la búsqueda global cubre todas las
  columnas (incluido el N° de inventario y la serie); corrige
  «tarjeta» por «fila» tras el rediseño a tabla tipo Excel.
- Paso 7: la vista de detalle se describe según su estado actual
  (datos copiables, historial unificado, pendientes y expedientes
  correctivos), sin la cuadrícula mensual «Programación y resultados
  2026» que fue eliminada.
- Nuevo Paso 14: documenta el botón de grabación de sesión para
  análisis de uso y mejora continua.

https://claude.ai/code/session_01NhvBx4HahisbYSnWJwVNHY
</commit_message>
<xml_diff>
--- a/docs/Flujo_Sistema_Gestion_MP_2026.docx
+++ b/docs/Flujo_Sistema_Gestion_MP_2026.docx
@@ -2844,7 +2844,7 @@
         <w:spacing w:after="60"/>
       </w:pPr>
       <w:r>
-        <w:t xml:space="preserve">Al presionar un equipo en la tabla, abrir una vista que muestre todos sus datos.</w:t>
+        <w:t xml:space="preserve">Al presionar un equipo en la tabla, abrir una vista que muestre todos sus datos (cada campo se copia al portapapeles con un clic), su historial de mantenciones unificado (una fila por mes con la programación, el resultado de la planilla y los registros de la aplicación), sus pendientes y sus expedientes de mantenimiento correctivo con línea de tiempo.</w:t>
       </w:r>
     </w:p>
     <w:p>
@@ -3375,20 +3375,20 @@
         <w:spacing w:after="60"/>
       </w:pPr>
       <w:r>
-        <w:t xml:space="preserve">Bandeja de gestión de pendientes: la vista global presenta los pendientes en una tabla tipo Excel — una fila por pendiente con columnas Equipo, Serie, Tipo, Urgencia (Atrasado / Hoy / Esta semana / Próximo / En espera / Completado), Estado de gestión, Compromiso, Días de atraso, Tareas, Responsables, En espera de, Última gestión y Fecha de completado — todas con filtros tipo Excel, búsqueda global, orden por urgencia por defecto, filas coloreadas según situación y exportación de la vista filtrada; con métricas de cabecera (abiertos, atrasados, en espera, completados de la semana y tiempo medio de resolución).</w:t>
-      </w:r>
-    </w:p>
-    <w:p>
-      <w:pPr>
-        <w:pStyle w:val="ListParagraph"/>
-        <w:numPr>
-          <w:ilvl w:val="0"/>
-          <w:numId w:val="2"/>
-        </w:numPr>
-        <w:spacing w:after="60"/>
-      </w:pPr>
-      <w:r>
-        <w:t xml:space="preserve">Acciones rápidas en cada tarjeta, sin abrir el formulario: completar (registra la fecha de completado y gestión automática), posponer el compromiso (+1, +3 o +7 días, dejando constancia), marcar En espera de un tercero con motivo (y reanudar), marcar tareas y registrar gestiones en línea.</w:t>
+        <w:t xml:space="preserve">Bandeja de gestión de pendientes: la vista global presenta los pendientes en una tabla tipo Excel — una fila por pendiente con columnas Equipo, Serie, N° Inventario, Servicio, Tipo, Urgencia (Atrasado / Hoy / Esta semana / Próximo / En espera / Completado), Estado de gestión, Compromiso, Días de atraso, Tareas, Responsables, En espera de, Última gestión y Fecha de completado — todas con filtros tipo Excel; la búsqueda global cubre todas las columnas, incluido el N° de inventario y la serie. Orden por urgencia por defecto, filas coloreadas según situación y exportación de la vista filtrada; con métricas de cabecera (abiertos, atrasados, en espera, completados de la semana y tiempo medio de resolución).</w:t>
+      </w:r>
+    </w:p>
+    <w:p>
+      <w:pPr>
+        <w:pStyle w:val="ListParagraph"/>
+        <w:numPr>
+          <w:ilvl w:val="0"/>
+          <w:numId w:val="2"/>
+        </w:numPr>
+        <w:spacing w:after="60"/>
+      </w:pPr>
+      <w:r>
+        <w:t xml:space="preserve">Acciones rápidas en cada fila, sin abrir el formulario: completar (registra la fecha de completado y gestión automática), posponer el compromiso (+1, +3 o +7 días, dejando constancia), marcar En espera de un tercero con motivo (y reanudar), marcar tareas y registrar gestiones en línea.</w:t>
       </w:r>
     </w:p>
     <w:p>
@@ -4066,6 +4066,40 @@
       </w:pPr>
       <w:r>
         <w:t xml:space="preserve">Todas las columnas cuentan con filtros tipo Excel (selección múltiple, búsqueda y orden), búsqueda global, paginación y exportación de la vista filtrada a Excel; cada fila abre la ficha del equipo.</w:t>
+      </w:r>
+    </w:p>
+    <w:p>
+      <w:pPr>
+        <w:pStyle w:val="Heading2"/>
+      </w:pPr>
+      <w:r>
+        <w:t xml:space="preserve">Paso 14. Grabación de sesión (mejora continua)</w:t>
+      </w:r>
+    </w:p>
+    <w:p>
+      <w:pPr>
+        <w:pStyle w:val="ListParagraph"/>
+        <w:numPr>
+          <w:ilvl w:val="0"/>
+          <w:numId w:val="2"/>
+        </w:numPr>
+        <w:spacing w:after="60"/>
+      </w:pPr>
+      <w:r>
+        <w:t xml:space="preserve">El botón «Grabar» de la barra superior registra localmente la interacción con la aplicación (clics, escritura, navegación entre vistas, apertura de formularios, filtros y tiempos) sin enviar nada fuera del computador.</w:t>
+      </w:r>
+    </w:p>
+    <w:p>
+      <w:pPr>
+        <w:pStyle w:val="ListParagraph"/>
+        <w:numPr>
+          <w:ilvl w:val="0"/>
+          <w:numId w:val="2"/>
+        </w:numPr>
+        <w:spacing w:after="60"/>
+      </w:pPr>
+      <w:r>
+        <w:t xml:space="preserve">Al detener la grabación se descarga un archivo que permite analizar el uso real y proponer mejoras de usabilidad. Si la pestaña se cierra con una grabación activa, el navegador pide confirmación.</w:t>
       </w:r>
     </w:p>
     <w:sectPr>

</xml_diff>

<commit_message>
Vista global de Correctivos en tabla tipo Excel
Nueva pestaña «Correctivos»: una fila por expediente (folio SIGEM),
uniendo la orden de trabajo con sus avances, con las columnas
solicitadas: ID (correlativo estable), Equipo, Tipo, Folio SIGEM,
Fecha del documento, Técnico, Empresa (la del último envío o compra),
Estado (etapa actual o Cerrado) y Días de ciclo (apertura → cierre u
hoy).

- Filtros tipo Excel por columna, búsqueda global (cubre también serie
  e inventario), orden por columna con días de ciclo numérico, y
  exportación de la vista filtrada.
- Orden por defecto: abiertos primero y mayor ciclo arriba; métricas
  de cabecera (expedientes, abiertos, con equipo detenido, cerrados y
  ciclo medio); los expedientes abiertos con más de 30 días resaltan
  los días en rojo; el badge del nav muestra los abiertos.
- Cada fila abre la ficha del equipo.

Build 2026-06-15.22. Actualiza la especificación Word (Paso 15).

https://claude.ai/code/session_01NhvBx4HahisbYSnWJwVNHY
</commit_message>
<xml_diff>
--- a/docs/Flujo_Sistema_Gestion_MP_2026.docx
+++ b/docs/Flujo_Sistema_Gestion_MP_2026.docx
@@ -4093,6 +4093,53 @@
       </w:pPr>
       <w:r>
         <w:t xml:space="preserve">Al detener la grabación se descarga un archivo que permite analizar el uso real y proponer mejoras de usabilidad. Si la pestaña se cierra con una grabación activa, el navegador pide confirmación.</w:t>
+      </w:r>
+    </w:p>
+    <w:p>
+      <w:pPr>
+        <w:pStyle w:val="Heading2"/>
+      </w:pPr>
+      <w:r>
+        <w:t xml:space="preserve">Paso 15. Vista global de Mantenimiento Correctivo</w:t>
+      </w:r>
+    </w:p>
+    <w:p>
+      <w:pPr>
+        <w:pStyle w:val="ListParagraph"/>
+        <w:numPr>
+          <w:ilvl w:val="0"/>
+          <w:numId w:val="2"/>
+        </w:numPr>
+        <w:spacing w:after="60"/>
+      </w:pPr>
+      <w:r>
+        <w:t xml:space="preserve">Vista tipo tabla con una fila por expediente (folio SIGEM), uniendo la orden de trabajo con sus avances.</w:t>
+      </w:r>
+    </w:p>
+    <w:p>
+      <w:pPr>
+        <w:pStyle w:val="ListParagraph"/>
+        <w:numPr>
+          <w:ilvl w:val="0"/>
+          <w:numId w:val="2"/>
+        </w:numPr>
+        <w:spacing w:after="60"/>
+      </w:pPr>
+      <w:r>
+        <w:t xml:space="preserve">Columnas: ID (correlativo del expediente), Equipo, Tipo, Folio SIGEM, Fecha del documento, Técnico, Empresa (la del último envío o compra), Estado (etapa actual del expediente o Cerrado) y Días de ciclo (desde la apertura hasta el cierre o, si está abierto, hasta hoy).</w:t>
+      </w:r>
+    </w:p>
+    <w:p>
+      <w:pPr>
+        <w:pStyle w:val="ListParagraph"/>
+        <w:numPr>
+          <w:ilvl w:val="0"/>
+          <w:numId w:val="2"/>
+        </w:numPr>
+        <w:spacing w:after="60"/>
+      </w:pPr>
+      <w:r>
+        <w:t xml:space="preserve">Todas las columnas cuentan con filtros tipo Excel (selección múltiple, búsqueda y orden); la búsqueda global cubre además la serie y el N° de inventario del equipo. Orden por defecto con los expedientes abiertos primero y mayor ciclo arriba; métricas de cabecera (expedientes, abiertos, con equipo detenido, cerrados y ciclo medio); exportación de la vista filtrada y cada fila abre la ficha del equipo.</w:t>
       </w:r>
     </w:p>
     <w:sectPr>

</xml_diff>

<commit_message>
Doc Word: tipo de mantenimiento, protocolos y motor de estado integral
Actualiza la especificación del flujo para reflejar la lógica vigente:
- Paso 2: cinco columnas calculadas, incorporando «Siguiente acción».
- Paso 8: campo «Tipo de mantenimiento» (Interno/Externo) y generación
  del protocolo de tareas al marcar gestión pendiente.
- Paso 9: el tipo de pendiente «Protocolo Interno/Externo» arma la lista
  de protocolo; tareas con estados Sí/No/Imprimir/Gestión + comentarios;
  volcado del texto sin agregar al guardar.
- Paso 12: motor de estado integral (estado + criticidad + siguiente
  acción) y Tablero de Operatividad ampliado (pendientes vencidos /
  protocolos sin resolver) con la siguiente acción por equipo.
</commit_message>
<xml_diff>
--- a/docs/Flujo_Sistema_Gestion_MP_2026.docx
+++ b/docs/Flujo_Sistema_Gestion_MP_2026.docx
@@ -166,7 +166,7 @@
         <w:spacing w:after="60"/>
       </w:pPr>
       <w:r>
-        <w:t xml:space="preserve">Al completar la carga, generar una vista tipo tabla con las mismas columnas del Paso 1, más cuatro columnas calculadas: Estado del equipo (Operativo / No Operativo / Servicio Técnico, según el último evento registrado), Días en estado (días transcurridos desde que el equipo entró a su estado actual), Última actualización (fecha más reciente de cualquier registro de la app para el equipo) y Pendientes (si el equipo tiene pendientes abiertos y cuántos). Todas las columnas cuentan con filtros tipo Excel; un selector permite elegir cuáles mostrar, con un conjunto compacto por defecto que evita el desplazamiento horizontal.</w:t>
+        <w:t xml:space="preserve">Al completar la carga, generar una vista tipo tabla con las mismas columnas del Paso 1, más cinco columnas calculadas derivadas del motor de estado integral (Paso 12): Estado del equipo (Operativo / No Operativo / Servicio Técnico, con color, según el último evento registrado), Días en estado, Siguiente acción (la tarea recomendada para asegurar la operatividad del equipo), Última actualización y Pendientes (si el equipo tiene pendientes abiertos y cuántos). Todas las columnas cuentan con filtros tipo Excel; un selector permite elegir cuáles mostrar, con un conjunto compacto por defecto que evita el desplazamiento horizontal.</w:t>
       </w:r>
     </w:p>
     <w:p>
@@ -3179,7 +3179,34 @@
         <w:spacing w:after="60"/>
       </w:pPr>
       <w:r>
-        <w:t xml:space="preserve">Gestión pendiente: casilla de selección Sí / No. Al marcarla, el sistema genera automáticamente un pendiente vinculado a esta mantención (con tipo derivado de la causal, fecha de compromiso a 30 días si es causal de reprogramación, y queda registrado en la bandeja aunque no se complete el formulario que se abre para enriquecerlo); no se duplica si la mantención se vuelve a guardar.</w:t>
+        <w:rPr>
+          <w:b/>
+          <w:bCs/>
+        </w:rPr>
+        <w:t xml:space="preserve">Tipo de mantenimiento: </w:t>
+      </w:r>
+      <w:r>
+        <w:t xml:space="preserve">dos botones — Interno / Externo. Define el protocolo de tareas que se generará en el pendiente al marcar gestión pendiente.</w:t>
+      </w:r>
+    </w:p>
+    <w:p>
+      <w:pPr>
+        <w:pStyle w:val="ListParagraph"/>
+        <w:numPr>
+          <w:ilvl w:val="0"/>
+          <w:numId w:val="2"/>
+        </w:numPr>
+        <w:spacing w:after="60"/>
+      </w:pPr>
+      <w:r>
+        <w:rPr>
+          <w:b/>
+          <w:bCs/>
+        </w:rPr>
+        <w:t xml:space="preserve">Gestión pendiente: </w:t>
+      </w:r>
+      <w:r>
+        <w:t xml:space="preserve">casilla de selección Sí / No. Al marcarla, el sistema genera automáticamente un pendiente vinculado a esta mantención con una lista de protocolo predeterminada según el tipo de mantenimiento: Interno genera «Protocolo de mantenimiento Interno»; Externo genera «Protocolo de mantenimiento Interno» y «Protocolo de mantenimiento Externo». La fecha de compromiso es a 30 días si el resultado es una causal de reprogramación; el pendiente queda en la bandeja aunque no se complete el formulario que se abre para enriquecerlo, y no se duplica si la mantención se vuelve a guardar.</w:t>
       </w:r>
     </w:p>
     <w:p>
@@ -3255,7 +3282,7 @@
         <w:t xml:space="preserve">Tipo de pendiente: </w:t>
       </w:r>
       <w:r>
-        <w:t xml:space="preserve">lista desplegable con: Reprogramación Mantención Preventiva, Protocolo Interno de Mantenimiento, Protocolo Externo de Mantenimiento, Pauta de Monitoreo Diario, Imprimir Documento y Otro.</w:t>
+        <w:t xml:space="preserve">lista desplegable con: Reprogramación Mantención Preventiva, Protocolo Interno de Mantenimiento, Protocolo Externo de Mantenimiento, Pauta de Monitoreo Diario, Imprimir Documento y Otro. Al elegir «Protocolo Interno de Mantenimiento» o «Protocolo Externo de Mantenimiento» (o al abrir un pendiente que ya tenga ese tipo) se arma automáticamente la lista de tareas de protocolo correspondiente.</w:t>
       </w:r>
     </w:p>
     <w:p>
@@ -3295,7 +3322,7 @@
         <w:t xml:space="preserve">Tareas: </w:t>
       </w:r>
       <w:r>
-        <w:t xml:space="preserve">listado de tareas asociadas al pendiente.</w:t>
+        <w:t xml:space="preserve">listado de tareas asociadas al pendiente. Las tareas de protocolo se marcan con uno de cuatro estados — Sí / No / Imprimir / Gestión — y admiten comentarios y actualizaciones propios con fecha; el contador «resueltas / total» considera resueltas las de respuesta definitiva (Sí o No). El texto escrito en «Nueva tarea» o «Nueva gestión» que no se haya agregado se incorpora al guardar para no perderlo.</w:t>
       </w:r>
     </w:p>
     <w:p>
@@ -3959,20 +3986,27 @@
         <w:spacing w:after="60"/>
       </w:pPr>
       <w:r>
-        <w:t xml:space="preserve">El foco del sistema es conocer en todo momento el estado de cada equipo para asegurar su operatividad y hacer las gestiones asociadas: el último estado vale más que el detalle.</w:t>
-      </w:r>
-    </w:p>
-    <w:p>
-      <w:pPr>
-        <w:pStyle w:val="ListParagraph"/>
-        <w:numPr>
-          <w:ilvl w:val="0"/>
-          <w:numId w:val="2"/>
-        </w:numPr>
-        <w:spacing w:after="60"/>
-      </w:pPr>
-      <w:r>
-        <w:t xml:space="preserve">Tablero de Operatividad: lista permanente de los equipos que requieren atención — no operativos, en servicio técnico (según el último evento, visita o cierre), con expediente correctivo abierto, o marcados FS/NU en la planilla sin resolución posterior — mostrando el último estado, la última gestión con su fecha y los días transcurridos, ordenados por criticidad.</w:t>
+        <w:t xml:space="preserve">El foco del sistema es conocer en todo momento el estado de cada equipo para asegurar su operatividad y hacer las gestiones asociadas: el último estado vale más que el detalle. Un único motor de estado integral deriva, para cada equipo, su estado operativo, su criticidad y la «siguiente acción» recomendada, priorizando lo que más afecta la operatividad: equipo detenido (No Operativo o en Servicio Técnico) con OT abierta → avanzar el expediente; caído sin OT → abrir correctivo; pendientes vencidos o protocolos sin resolver; MP del mes o de meses anteriores sin ejecutar; y FS/NU en la planilla sin resolución posterior. De ese motor se alimentan, de forma consistente, la tabla de Equipos, la ficha del equipo (con un banner de siguiente acción e indicadores) y el Tablero de Operatividad.</w:t>
+      </w:r>
+    </w:p>
+    <w:p>
+      <w:pPr>
+        <w:pStyle w:val="ListParagraph"/>
+        <w:numPr>
+          <w:ilvl w:val="0"/>
+          <w:numId w:val="2"/>
+        </w:numPr>
+        <w:spacing w:after="60"/>
+      </w:pPr>
+      <w:r>
+        <w:rPr>
+          <w:b/>
+          <w:bCs/>
+        </w:rPr>
+        <w:t xml:space="preserve">Tablero de Operatividad: </w:t>
+      </w:r>
+      <w:r>
+        <w:t xml:space="preserve">lista permanente de los equipos que requieren atención — no operativos, en servicio técnico (según el último evento, visita o cierre), con expediente correctivo abierto, con pendientes vencidos o protocolos sin resolver, o marcados FS/NU en la planilla sin resolución posterior — mostrando el último estado, la última gestión con su fecha, los días transcurridos y la siguiente acción de cada equipo, ordenados por criticidad.</w:t>
       </w:r>
     </w:p>
     <w:p>

</xml_diff>

<commit_message>
Pendientes: orden de columnas, compromiso del evento y «Volver» a origen
Tres ajustes pedidos (y uno detectado en una grabación):

1) Orden de columnas de Pendientes: las del equipo siguen el orden de la
   planilla — ID, N° Carpeta, N° Inventario, Equipo, Servicio, Unidad,
   Ubicación, Procedencia, Marca, Modelo, Serie, Año, Vida Útil,
   Clasificación, ENU — y luego las propias del pendiente. La columna ID
   del equipo se etiqueta «ID» (clave interna eqId).

2) Fecha de compromiso = fecha del evento. Al generar el pendiente desde
   una MP (mantención o reprogramación), el compromiso toma la fecha de
   esa MP en lugar de hoy+7 / fecha+30.

3) Botón «← Volver» de la ficha: regresa a la vista desde la que se abrió
   (Equipos, Pendientes, Operatividad o Correctivos), con etiqueta
   dinámica; antes siempre llevaba a Equipos. En la grabación, el usuario
   venía de Pendientes y quedaba en Equipos.

APP_BUILD 2026-06-16.35, versión autónoma, README y documento Word
actualizados.
</commit_message>
<xml_diff>
--- a/docs/Flujo_Sistema_Gestion_MP_2026.docx
+++ b/docs/Flujo_Sistema_Gestion_MP_2026.docx
@@ -2912,22 +2912,6 @@
     </w:p>
     <w:p>
       <w:pPr>
-        <w:pStyle w:val="Heading2"/>
-      </w:pPr>
-      <w:r>
-        <w:t xml:space="preserve">Paso 8. Formulario de Mantenimiento Preventivo</w:t>
-      </w:r>
-    </w:p>
-    <w:p>
-      <w:pPr>
-        <w:spacing w:after="120"/>
-      </w:pPr>
-      <w:r>
-        <w:t xml:space="preserve">Al presionar el botón “Mantenimiento Preventivo”, desplegar un formulario con los siguientes campos:</w:t>
-      </w:r>
-    </w:p>
-    <w:p>
-      <w:pPr>
         <w:pStyle w:val="ListParagraph"/>
         <w:numPr>
           <w:ilvl w:val="0"/>
@@ -2940,10 +2924,26 @@
           <w:b/>
           <w:bCs/>
         </w:rPr>
-        <w:t xml:space="preserve">Fecha</w:t>
-      </w:r>
-      <w:r>
-        <w:t xml:space="preserve"> de la mantención.</w:t>
+        <w:t xml:space="preserve">Volver: </w:t>
+      </w:r>
+      <w:r>
+        <w:t xml:space="preserve">el botón «← Volver» de la ficha regresa a la vista desde la que se abrió (Equipos, Pendientes, Operatividad o Correctivos), no siempre a Equipos.</w:t>
+      </w:r>
+    </w:p>
+    <w:p>
+      <w:pPr>
+        <w:pStyle w:val="Heading2"/>
+      </w:pPr>
+      <w:r>
+        <w:t xml:space="preserve">Paso 8. Formulario de Mantenimiento Preventivo</w:t>
+      </w:r>
+    </w:p>
+    <w:p>
+      <w:pPr>
+        <w:spacing w:after="120"/>
+      </w:pPr>
+      <w:r>
+        <w:t xml:space="preserve">Al presionar el botón “Mantenimiento Preventivo”, desplegar un formulario con los siguientes campos:</w:t>
       </w:r>
     </w:p>
     <w:p>
@@ -2960,10 +2960,10 @@
           <w:b/>
           <w:bCs/>
         </w:rPr>
-        <w:t xml:space="preserve">Programación: </w:t>
-      </w:r>
-      <w:r>
-        <w:t xml:space="preserve">lista desplegable con las opciones X, R, RA y PM.</w:t>
+        <w:t xml:space="preserve">Fecha</w:t>
+      </w:r>
+      <w:r>
+        <w:t xml:space="preserve"> de la mantención.</w:t>
       </w:r>
     </w:p>
     <w:p>
@@ -2980,153 +2980,10 @@
           <w:b/>
           <w:bCs/>
         </w:rPr>
-        <w:t xml:space="preserve">Ejecutor: </w:t>
-      </w:r>
-      <w:r>
-        <w:t xml:space="preserve">lista desplegable con las siguientes opciones:</w:t>
-      </w:r>
-    </w:p>
-    <w:p>
-      <w:pPr>
-        <w:pStyle w:val="ListParagraph"/>
-        <w:numPr>
-          <w:ilvl w:val="1"/>
-          <w:numId w:val="2"/>
-        </w:numPr>
-        <w:spacing w:after="60"/>
-      </w:pPr>
-      <w:r>
-        <w:t xml:space="preserve">Carlos Bahamondes Seguel</w:t>
-      </w:r>
-    </w:p>
-    <w:p>
-      <w:pPr>
-        <w:pStyle w:val="ListParagraph"/>
-        <w:numPr>
-          <w:ilvl w:val="1"/>
-          <w:numId w:val="2"/>
-        </w:numPr>
-        <w:spacing w:after="60"/>
-      </w:pPr>
-      <w:r>
-        <w:t xml:space="preserve">Cristián Beltrán Oviedo</w:t>
-      </w:r>
-    </w:p>
-    <w:p>
-      <w:pPr>
-        <w:pStyle w:val="ListParagraph"/>
-        <w:numPr>
-          <w:ilvl w:val="1"/>
-          <w:numId w:val="2"/>
-        </w:numPr>
-        <w:spacing w:after="60"/>
-      </w:pPr>
-      <w:r>
-        <w:t xml:space="preserve">Cristina Rozas Urrutia</w:t>
-      </w:r>
-    </w:p>
-    <w:p>
-      <w:pPr>
-        <w:pStyle w:val="ListParagraph"/>
-        <w:numPr>
-          <w:ilvl w:val="1"/>
-          <w:numId w:val="2"/>
-        </w:numPr>
-        <w:spacing w:after="60"/>
-      </w:pPr>
-      <w:r>
-        <w:t xml:space="preserve">Daniel Díaz Neira</w:t>
-      </w:r>
-    </w:p>
-    <w:p>
-      <w:pPr>
-        <w:pStyle w:val="ListParagraph"/>
-        <w:numPr>
-          <w:ilvl w:val="1"/>
-          <w:numId w:val="2"/>
-        </w:numPr>
-        <w:spacing w:after="60"/>
-      </w:pPr>
-      <w:r>
-        <w:t xml:space="preserve">Ignacio Berner Bergara</w:t>
-      </w:r>
-    </w:p>
-    <w:p>
-      <w:pPr>
-        <w:pStyle w:val="ListParagraph"/>
-        <w:numPr>
-          <w:ilvl w:val="1"/>
-          <w:numId w:val="2"/>
-        </w:numPr>
-        <w:spacing w:after="60"/>
-      </w:pPr>
-      <w:r>
-        <w:t xml:space="preserve">Macarena Toledo</w:t>
-      </w:r>
-    </w:p>
-    <w:p>
-      <w:pPr>
-        <w:pStyle w:val="ListParagraph"/>
-        <w:numPr>
-          <w:ilvl w:val="1"/>
-          <w:numId w:val="2"/>
-        </w:numPr>
-        <w:spacing w:after="60"/>
-      </w:pPr>
-      <w:r>
-        <w:t xml:space="preserve">Marco Ulloa</w:t>
-      </w:r>
-    </w:p>
-    <w:p>
-      <w:pPr>
-        <w:pStyle w:val="ListParagraph"/>
-        <w:numPr>
-          <w:ilvl w:val="1"/>
-          <w:numId w:val="2"/>
-        </w:numPr>
-        <w:spacing w:after="60"/>
-      </w:pPr>
-      <w:r>
-        <w:t xml:space="preserve">Matías Soazo Garrido</w:t>
-      </w:r>
-    </w:p>
-    <w:p>
-      <w:pPr>
-        <w:pStyle w:val="ListParagraph"/>
-        <w:numPr>
-          <w:ilvl w:val="1"/>
-          <w:numId w:val="2"/>
-        </w:numPr>
-        <w:spacing w:after="60"/>
-      </w:pPr>
-      <w:r>
-        <w:t xml:space="preserve">Ricardo Matus Aroca</w:t>
-      </w:r>
-    </w:p>
-    <w:p>
-      <w:pPr>
-        <w:pStyle w:val="ListParagraph"/>
-        <w:numPr>
-          <w:ilvl w:val="1"/>
-          <w:numId w:val="2"/>
-        </w:numPr>
-        <w:spacing w:after="60"/>
-      </w:pPr>
-      <w:r>
-        <w:t xml:space="preserve">Tito Millapán Riquelme</w:t>
-      </w:r>
-    </w:p>
-    <w:p>
-      <w:pPr>
-        <w:pStyle w:val="ListParagraph"/>
-        <w:numPr>
-          <w:ilvl w:val="1"/>
-          <w:numId w:val="2"/>
-        </w:numPr>
-        <w:spacing w:after="60"/>
-      </w:pPr>
-      <w:r>
-        <w:t xml:space="preserve">Personal Externo</w:t>
+        <w:t xml:space="preserve">Programación: </w:t>
+      </w:r>
+      <w:r>
+        <w:t xml:space="preserve">lista desplegable con las opciones X, R, RA y PM.</w:t>
       </w:r>
     </w:p>
     <w:p>
@@ -3143,10 +3000,153 @@
           <w:b/>
           <w:bCs/>
         </w:rPr>
-        <w:t xml:space="preserve">Resultado: </w:t>
-      </w:r>
-      <w:r>
-        <w:t xml:space="preserve">lista desplegable con: Si, C1, C2, C3, C4, C5, C6, C7, C8, Si-RA, FS, No, NU y Baja.</w:t>
+        <w:t xml:space="preserve">Ejecutor: </w:t>
+      </w:r>
+      <w:r>
+        <w:t xml:space="preserve">lista desplegable con las siguientes opciones:</w:t>
+      </w:r>
+    </w:p>
+    <w:p>
+      <w:pPr>
+        <w:pStyle w:val="ListParagraph"/>
+        <w:numPr>
+          <w:ilvl w:val="1"/>
+          <w:numId w:val="2"/>
+        </w:numPr>
+        <w:spacing w:after="60"/>
+      </w:pPr>
+      <w:r>
+        <w:t xml:space="preserve">Carlos Bahamondes Seguel</w:t>
+      </w:r>
+    </w:p>
+    <w:p>
+      <w:pPr>
+        <w:pStyle w:val="ListParagraph"/>
+        <w:numPr>
+          <w:ilvl w:val="1"/>
+          <w:numId w:val="2"/>
+        </w:numPr>
+        <w:spacing w:after="60"/>
+      </w:pPr>
+      <w:r>
+        <w:t xml:space="preserve">Cristián Beltrán Oviedo</w:t>
+      </w:r>
+    </w:p>
+    <w:p>
+      <w:pPr>
+        <w:pStyle w:val="ListParagraph"/>
+        <w:numPr>
+          <w:ilvl w:val="1"/>
+          <w:numId w:val="2"/>
+        </w:numPr>
+        <w:spacing w:after="60"/>
+      </w:pPr>
+      <w:r>
+        <w:t xml:space="preserve">Cristina Rozas Urrutia</w:t>
+      </w:r>
+    </w:p>
+    <w:p>
+      <w:pPr>
+        <w:pStyle w:val="ListParagraph"/>
+        <w:numPr>
+          <w:ilvl w:val="1"/>
+          <w:numId w:val="2"/>
+        </w:numPr>
+        <w:spacing w:after="60"/>
+      </w:pPr>
+      <w:r>
+        <w:t xml:space="preserve">Daniel Díaz Neira</w:t>
+      </w:r>
+    </w:p>
+    <w:p>
+      <w:pPr>
+        <w:pStyle w:val="ListParagraph"/>
+        <w:numPr>
+          <w:ilvl w:val="1"/>
+          <w:numId w:val="2"/>
+        </w:numPr>
+        <w:spacing w:after="60"/>
+      </w:pPr>
+      <w:r>
+        <w:t xml:space="preserve">Ignacio Berner Bergara</w:t>
+      </w:r>
+    </w:p>
+    <w:p>
+      <w:pPr>
+        <w:pStyle w:val="ListParagraph"/>
+        <w:numPr>
+          <w:ilvl w:val="1"/>
+          <w:numId w:val="2"/>
+        </w:numPr>
+        <w:spacing w:after="60"/>
+      </w:pPr>
+      <w:r>
+        <w:t xml:space="preserve">Macarena Toledo</w:t>
+      </w:r>
+    </w:p>
+    <w:p>
+      <w:pPr>
+        <w:pStyle w:val="ListParagraph"/>
+        <w:numPr>
+          <w:ilvl w:val="1"/>
+          <w:numId w:val="2"/>
+        </w:numPr>
+        <w:spacing w:after="60"/>
+      </w:pPr>
+      <w:r>
+        <w:t xml:space="preserve">Marco Ulloa</w:t>
+      </w:r>
+    </w:p>
+    <w:p>
+      <w:pPr>
+        <w:pStyle w:val="ListParagraph"/>
+        <w:numPr>
+          <w:ilvl w:val="1"/>
+          <w:numId w:val="2"/>
+        </w:numPr>
+        <w:spacing w:after="60"/>
+      </w:pPr>
+      <w:r>
+        <w:t xml:space="preserve">Matías Soazo Garrido</w:t>
+      </w:r>
+    </w:p>
+    <w:p>
+      <w:pPr>
+        <w:pStyle w:val="ListParagraph"/>
+        <w:numPr>
+          <w:ilvl w:val="1"/>
+          <w:numId w:val="2"/>
+        </w:numPr>
+        <w:spacing w:after="60"/>
+      </w:pPr>
+      <w:r>
+        <w:t xml:space="preserve">Ricardo Matus Aroca</w:t>
+      </w:r>
+    </w:p>
+    <w:p>
+      <w:pPr>
+        <w:pStyle w:val="ListParagraph"/>
+        <w:numPr>
+          <w:ilvl w:val="1"/>
+          <w:numId w:val="2"/>
+        </w:numPr>
+        <w:spacing w:after="60"/>
+      </w:pPr>
+      <w:r>
+        <w:t xml:space="preserve">Tito Millapán Riquelme</w:t>
+      </w:r>
+    </w:p>
+    <w:p>
+      <w:pPr>
+        <w:pStyle w:val="ListParagraph"/>
+        <w:numPr>
+          <w:ilvl w:val="1"/>
+          <w:numId w:val="2"/>
+        </w:numPr>
+        <w:spacing w:after="60"/>
+      </w:pPr>
+      <w:r>
+        <w:t xml:space="preserve">Personal Externo</w:t>
       </w:r>
     </w:p>
     <w:p>
@@ -3163,10 +3163,10 @@
           <w:b/>
           <w:bCs/>
         </w:rPr>
-        <w:t xml:space="preserve">Observaciones: </w:t>
-      </w:r>
-      <w:r>
-        <w:t xml:space="preserve">campo de texto opcional.</w:t>
+        <w:t xml:space="preserve">Resultado: </w:t>
+      </w:r>
+      <w:r>
+        <w:t xml:space="preserve">lista desplegable con: Si, C1, C2, C3, C4, C5, C6, C7, C8, Si-RA, FS, No, NU y Baja.</w:t>
       </w:r>
     </w:p>
     <w:p>
@@ -3183,10 +3183,10 @@
           <w:b/>
           <w:bCs/>
         </w:rPr>
-        <w:t xml:space="preserve">Estado del equipo: </w:t>
-      </w:r>
-      <w:r>
-        <w:t xml:space="preserve">dos botones — Operativo / No Operativo.</w:t>
+        <w:t xml:space="preserve">Observaciones: </w:t>
+      </w:r>
+      <w:r>
+        <w:t xml:space="preserve">campo de texto opcional.</w:t>
       </w:r>
     </w:p>
     <w:p>
@@ -3203,10 +3203,10 @@
           <w:b/>
           <w:bCs/>
         </w:rPr>
-        <w:t xml:space="preserve">Tipo de mantenimiento: </w:t>
-      </w:r>
-      <w:r>
-        <w:t xml:space="preserve">dos botones — Interno / Externo. Define el protocolo de tareas que se generará en el pendiente al marcar gestión pendiente.</w:t>
+        <w:t xml:space="preserve">Estado del equipo: </w:t>
+      </w:r>
+      <w:r>
+        <w:t xml:space="preserve">dos botones — Operativo / No Operativo.</w:t>
       </w:r>
     </w:p>
     <w:p>
@@ -3223,10 +3223,30 @@
           <w:b/>
           <w:bCs/>
         </w:rPr>
+        <w:t xml:space="preserve">Tipo de mantenimiento: </w:t>
+      </w:r>
+      <w:r>
+        <w:t xml:space="preserve">dos botones — Interno / Externo. Define el protocolo de tareas que se generará en el pendiente al marcar gestión pendiente.</w:t>
+      </w:r>
+    </w:p>
+    <w:p>
+      <w:pPr>
+        <w:pStyle w:val="ListParagraph"/>
+        <w:numPr>
+          <w:ilvl w:val="0"/>
+          <w:numId w:val="2"/>
+        </w:numPr>
+        <w:spacing w:after="60"/>
+      </w:pPr>
+      <w:r>
+        <w:rPr>
+          <w:b/>
+          <w:bCs/>
+        </w:rPr>
         <w:t xml:space="preserve">Gestión pendiente: </w:t>
       </w:r>
       <w:r>
-        <w:t xml:space="preserve">casilla de selección Sí / No. Al marcarla, el sistema genera automáticamente un pendiente vinculado a esta mantención con una lista de protocolo predeterminada según el tipo de mantenimiento: Interno genera «Protocolo de mantenimiento Interno»; Externo genera «Protocolo de mantenimiento Interno» y «Protocolo de mantenimiento Externo». La fecha de compromiso es a 30 días si el resultado es una causal de reprogramación; el pendiente queda en la bandeja aunque no se complete el formulario que se abre para enriquecerlo, y no se duplica si la mantención se vuelve a guardar.</w:t>
+        <w:t xml:space="preserve">casilla de selección Sí / No. Al marcarla, el sistema genera automáticamente un pendiente vinculado a esta mantención con una lista de protocolo predeterminada según el tipo de mantenimiento: Interno genera «Protocolo de mantenimiento Interno»; Externo genera «Protocolo de mantenimiento Interno» y «Protocolo de mantenimiento Externo». La fecha de compromiso del pendiente es la del evento que lo origina (la fecha de la mantención o de la reprogramación); el pendiente queda en la bandeja aunque no se complete el formulario que se abre para enriquecerlo, y no se duplica si la mantención se vuelve a guardar.</w:t>
       </w:r>
     </w:p>
     <w:p>

</xml_diff>